<commit_message>
How to use this script
</commit_message>
<xml_diff>
--- a/templates/certificado.docx
+++ b/templates/certificado.docx
@@ -1082,8 +1082,18 @@
                             <w:pPr>
                               <w:spacing w:before="15" w:after="15" w:line="240" w:lineRule="auto"/>
                               <w:jc w:val="center"/>
+                              <w:rPr>
+                                <w:rFonts w:ascii="Bookman Old Style" w:hAnsi="Bookman Old Style"/>
+                                <w:sz w:val="44"/>
+                                <w:szCs w:val="44"/>
+                              </w:rPr>
                             </w:pPr>
                             <w:r>
+                              <w:rPr>
+                                <w:rFonts w:ascii="Bookman Old Style" w:hAnsi="Bookman Old Style"/>
+                                <w:sz w:val="44"/>
+                                <w:szCs w:val="44"/>
+                              </w:rPr>
                               <w:t>{{ nome }}</w:t>
                             </w:r>
                           </w:p>
@@ -1120,7 +1130,12 @@
                               <w:t xml:space="preserve">Inscrito no CR </w:t>
                             </w:r>
                             <w:r>
-                              <w:t>{{ cr_atleta }}</w:t>
+                              <w:rPr>
+                                <w:rFonts w:ascii="Bookman Old Style" w:hAnsi="Bookman Old Style"/>
+                                <w:sz w:val="28"/>
+                                <w:szCs w:val="28"/>
+                              </w:rPr>
+                              <w:t>"{{ cr_atleta }}"</w:t>
                             </w:r>
                           </w:p>
                           <w:p>
@@ -1330,6 +1345,11 @@
                               <w:t xml:space="preserve">Arma: </w:t>
                             </w:r>
                             <w:r>
+                              <w:rPr>
+                                <w:rFonts w:ascii="Bookman Old Style" w:hAnsi="Bookman Old Style"/>
+                                <w:sz w:val="28"/>
+                                <w:szCs w:val="28"/>
+                              </w:rPr>
                               <w:t>{{ arma_modelo }}</w:t>
                             </w:r>
                             <w:r>
@@ -1348,6 +1368,11 @@
                               <w:t xml:space="preserve"> </w:t>
                             </w:r>
                             <w:r>
+                              <w:rPr>
+                                <w:rFonts w:ascii="Bookman Old Style" w:hAnsi="Bookman Old Style"/>
+                                <w:sz w:val="28"/>
+                                <w:szCs w:val="28"/>
+                              </w:rPr>
                               <w:t>{{ calibre }}</w:t>
                             </w:r>
                             <w:r>
@@ -1399,10 +1424,12 @@
                               <w:t xml:space="preserve">Sigma: </w:t>
                             </w:r>
                             <w:r>
-                              <w:t>{{ sigma }}</w:t>
-                            </w:r>
-                            <w:r>
-                              <w:t xml:space="preserve"> </w:t>
+                              <w:rPr>
+                                <w:rFonts w:ascii="Bookman Old Style" w:hAnsi="Bookman Old Style"/>
+                                <w:sz w:val="28"/>
+                                <w:szCs w:val="28"/>
+                              </w:rPr>
+                              <w:t xml:space="preserve">{{ sigma }} </w:t>
                             </w:r>
                             <w:r>
                               <w:rPr>
@@ -1420,6 +1447,11 @@
                               <w:t xml:space="preserve">- Com mínimo de </w:t>
                             </w:r>
                             <w:r>
+                              <w:rPr>
+                                <w:rFonts w:ascii="Bookman Old Style" w:hAnsi="Bookman Old Style"/>
+                                <w:sz w:val="28"/>
+                                <w:szCs w:val="28"/>
+                              </w:rPr>
                               <w:t>{{ min_disparos }}</w:t>
                             </w:r>
                             <w:r>
@@ -1471,7 +1503,28 @@
                               <w:t xml:space="preserve">Na Divisão </w:t>
                             </w:r>
                             <w:r>
+                              <w:rPr>
+                                <w:rFonts w:ascii="Bookman Old Style" w:hAnsi="Bookman Old Style"/>
+                                <w:sz w:val="28"/>
+                                <w:szCs w:val="28"/>
+                              </w:rPr>
+                              <w:t>"</w:t>
+                            </w:r>
+                            <w:r>
+                              <w:rPr>
+                                <w:rFonts w:ascii="Bookman Old Style" w:hAnsi="Bookman Old Style"/>
+                                <w:sz w:val="28"/>
+                                <w:szCs w:val="28"/>
+                              </w:rPr>
                               <w:t>{{ divisao }}</w:t>
+                            </w:r>
+                            <w:r>
+                              <w:rPr>
+                                <w:rFonts w:ascii="Bookman Old Style" w:hAnsi="Bookman Old Style"/>
+                                <w:sz w:val="28"/>
+                                <w:szCs w:val="28"/>
+                              </w:rPr>
+                              <w:t>"</w:t>
                             </w:r>
                             <w:r>
                               <w:rPr>
@@ -1521,7 +1574,28 @@
                               <w:t xml:space="preserve">Na Categoria </w:t>
                             </w:r>
                             <w:r>
+                              <w:rPr>
+                                <w:rFonts w:ascii="Bookman Old Style" w:hAnsi="Bookman Old Style"/>
+                                <w:sz w:val="28"/>
+                                <w:szCs w:val="28"/>
+                              </w:rPr>
+                              <w:t>"</w:t>
+                            </w:r>
+                            <w:r>
+                              <w:rPr>
+                                <w:rFonts w:ascii="Bookman Old Style" w:hAnsi="Bookman Old Style"/>
+                                <w:sz w:val="28"/>
+                                <w:szCs w:val="28"/>
+                              </w:rPr>
                               <w:t>{{ categoria }}</w:t>
+                            </w:r>
+                            <w:r>
+                              <w:rPr>
+                                <w:rFonts w:ascii="Bookman Old Style" w:hAnsi="Bookman Old Style"/>
+                                <w:sz w:val="28"/>
+                                <w:szCs w:val="28"/>
+                              </w:rPr>
+                              <w:t>"</w:t>
                             </w:r>
                           </w:p>
                           <w:p>
@@ -1557,6 +1631,11 @@
                               <w:t xml:space="preserve">Ranking: </w:t>
                             </w:r>
                             <w:r>
+                              <w:rPr>
+                                <w:rFonts w:ascii="Bookman Old Style" w:hAnsi="Bookman Old Style"/>
+                                <w:sz w:val="28"/>
+                                <w:szCs w:val="28"/>
+                              </w:rPr>
                               <w:t>{{ posicao }}</w:t>
                             </w:r>
                           </w:p>
@@ -1593,6 +1672,11 @@
                               <w:t xml:space="preserve">Identificador: </w:t>
                             </w:r>
                             <w:r>
+                              <w:rPr>
+                                <w:rFonts w:ascii="Bookman Old Style" w:hAnsi="Bookman Old Style"/>
+                                <w:sz w:val="28"/>
+                                <w:szCs w:val="28"/>
+                              </w:rPr>
                               <w:t>{{ identificador }}</w:t>
                             </w:r>
                             <w:r>
@@ -1634,8 +1718,18 @@
                       <w:pPr>
                         <w:spacing w:before="15" w:after="15" w:line="240" w:lineRule="auto"/>
                         <w:jc w:val="center"/>
+                        <w:rPr>
+                          <w:rFonts w:ascii="Bookman Old Style" w:hAnsi="Bookman Old Style"/>
+                          <w:sz w:val="44"/>
+                          <w:szCs w:val="44"/>
+                        </w:rPr>
                       </w:pPr>
                       <w:r>
+                        <w:rPr>
+                          <w:rFonts w:ascii="Bookman Old Style" w:hAnsi="Bookman Old Style"/>
+                          <w:sz w:val="44"/>
+                          <w:szCs w:val="44"/>
+                        </w:rPr>
                         <w:t>{{ nome }}</w:t>
                       </w:r>
                     </w:p>
@@ -1672,7 +1766,12 @@
                         <w:t xml:space="preserve">Inscrito no CR </w:t>
                       </w:r>
                       <w:r>
-                        <w:t>{{ cr_atleta }}</w:t>
+                        <w:rPr>
+                          <w:rFonts w:ascii="Bookman Old Style" w:hAnsi="Bookman Old Style"/>
+                          <w:sz w:val="28"/>
+                          <w:szCs w:val="28"/>
+                        </w:rPr>
+                        <w:t>"{{ cr_atleta }}"</w:t>
                       </w:r>
                     </w:p>
                     <w:p>
@@ -1882,6 +1981,11 @@
                         <w:t xml:space="preserve">Arma: </w:t>
                       </w:r>
                       <w:r>
+                        <w:rPr>
+                          <w:rFonts w:ascii="Bookman Old Style" w:hAnsi="Bookman Old Style"/>
+                          <w:sz w:val="28"/>
+                          <w:szCs w:val="28"/>
+                        </w:rPr>
                         <w:t>{{ arma_modelo }}</w:t>
                       </w:r>
                       <w:r>
@@ -1900,6 +2004,11 @@
                         <w:t xml:space="preserve"> </w:t>
                       </w:r>
                       <w:r>
+                        <w:rPr>
+                          <w:rFonts w:ascii="Bookman Old Style" w:hAnsi="Bookman Old Style"/>
+                          <w:sz w:val="28"/>
+                          <w:szCs w:val="28"/>
+                        </w:rPr>
                         <w:t>{{ calibre }}</w:t>
                       </w:r>
                       <w:r>
@@ -1951,10 +2060,12 @@
                         <w:t xml:space="preserve">Sigma: </w:t>
                       </w:r>
                       <w:r>
-                        <w:t>{{ sigma }}</w:t>
-                      </w:r>
-                      <w:r>
-                        <w:t xml:space="preserve"> </w:t>
+                        <w:rPr>
+                          <w:rFonts w:ascii="Bookman Old Style" w:hAnsi="Bookman Old Style"/>
+                          <w:sz w:val="28"/>
+                          <w:szCs w:val="28"/>
+                        </w:rPr>
+                        <w:t xml:space="preserve">{{ sigma }} </w:t>
                       </w:r>
                       <w:r>
                         <w:rPr>
@@ -1972,6 +2083,11 @@
                         <w:t xml:space="preserve">- Com mínimo de </w:t>
                       </w:r>
                       <w:r>
+                        <w:rPr>
+                          <w:rFonts w:ascii="Bookman Old Style" w:hAnsi="Bookman Old Style"/>
+                          <w:sz w:val="28"/>
+                          <w:szCs w:val="28"/>
+                        </w:rPr>
                         <w:t>{{ min_disparos }}</w:t>
                       </w:r>
                       <w:r>
@@ -2023,7 +2139,28 @@
                         <w:t xml:space="preserve">Na Divisão </w:t>
                       </w:r>
                       <w:r>
+                        <w:rPr>
+                          <w:rFonts w:ascii="Bookman Old Style" w:hAnsi="Bookman Old Style"/>
+                          <w:sz w:val="28"/>
+                          <w:szCs w:val="28"/>
+                        </w:rPr>
+                        <w:t>"</w:t>
+                      </w:r>
+                      <w:r>
+                        <w:rPr>
+                          <w:rFonts w:ascii="Bookman Old Style" w:hAnsi="Bookman Old Style"/>
+                          <w:sz w:val="28"/>
+                          <w:szCs w:val="28"/>
+                        </w:rPr>
                         <w:t>{{ divisao }}</w:t>
+                      </w:r>
+                      <w:r>
+                        <w:rPr>
+                          <w:rFonts w:ascii="Bookman Old Style" w:hAnsi="Bookman Old Style"/>
+                          <w:sz w:val="28"/>
+                          <w:szCs w:val="28"/>
+                        </w:rPr>
+                        <w:t>"</w:t>
                       </w:r>
                       <w:r>
                         <w:rPr>
@@ -2073,7 +2210,28 @@
                         <w:t xml:space="preserve">Na Categoria </w:t>
                       </w:r>
                       <w:r>
+                        <w:rPr>
+                          <w:rFonts w:ascii="Bookman Old Style" w:hAnsi="Bookman Old Style"/>
+                          <w:sz w:val="28"/>
+                          <w:szCs w:val="28"/>
+                        </w:rPr>
+                        <w:t>"</w:t>
+                      </w:r>
+                      <w:r>
+                        <w:rPr>
+                          <w:rFonts w:ascii="Bookman Old Style" w:hAnsi="Bookman Old Style"/>
+                          <w:sz w:val="28"/>
+                          <w:szCs w:val="28"/>
+                        </w:rPr>
                         <w:t>{{ categoria }}</w:t>
+                      </w:r>
+                      <w:r>
+                        <w:rPr>
+                          <w:rFonts w:ascii="Bookman Old Style" w:hAnsi="Bookman Old Style"/>
+                          <w:sz w:val="28"/>
+                          <w:szCs w:val="28"/>
+                        </w:rPr>
+                        <w:t>"</w:t>
                       </w:r>
                     </w:p>
                     <w:p>
@@ -2109,6 +2267,11 @@
                         <w:t xml:space="preserve">Ranking: </w:t>
                       </w:r>
                       <w:r>
+                        <w:rPr>
+                          <w:rFonts w:ascii="Bookman Old Style" w:hAnsi="Bookman Old Style"/>
+                          <w:sz w:val="28"/>
+                          <w:szCs w:val="28"/>
+                        </w:rPr>
                         <w:t>{{ posicao }}</w:t>
                       </w:r>
                     </w:p>
@@ -2145,6 +2308,11 @@
                         <w:t xml:space="preserve">Identificador: </w:t>
                       </w:r>
                       <w:r>
+                        <w:rPr>
+                          <w:rFonts w:ascii="Bookman Old Style" w:hAnsi="Bookman Old Style"/>
+                          <w:sz w:val="28"/>
+                          <w:szCs w:val="28"/>
+                        </w:rPr>
                         <w:t>{{ identificador }}</w:t>
                       </w:r>
                       <w:r>

</xml_diff>